<commit_message>
fix: align tested workflows and user guide
</commit_message>
<xml_diff>
--- a/docs/Panduan_Pengguna_IPSRS.docx
+++ b/docs/Panduan_Pengguna_IPSRS.docx
@@ -230,13 +230,13 @@
         <w:br/>
         <w:t>Gambar 2.2. Halaman Portal Laporan Kerusakan Publik.</w:t>
         <w:br/>
-        <w:t>Gambar 2.3. Halaman Daftar Laporan Kerusakan di Akun Teknisi.</w:t>
+        <w:t>Gambar 2.3. Halaman Antrean &amp; Pekerjaan Teknisi di Akun Teknisi.</w:t>
         <w:br/>
         <w:t>Gambar 2.4. Halaman Panel Kendali Status Perbaikan.</w:t>
         <w:br/>
         <w:t>Gambar 2.5. Halaman Konfirmasi Penyelesaian Pekerjaan (Tutup Tiket).</w:t>
         <w:br/>
-        <w:t>Gambar 2B.1. Halaman Daftar Tiket Laporan Milik Ruangan (Pelapor Internal).</w:t>
+        <w:t>Gambar 2B.1. Halaman Laporan Kerusakan Saya di Akun Pelapor.</w:t>
         <w:br/>
         <w:t>Gambar 2B.2. Tampilan Indikator Status Perbaikan.</w:t>
         <w:br/>
@@ -258,7 +258,7 @@
         <w:br/>
         <w:t>Gambar 5.1. Halaman Daftar Peminjaman Aset.</w:t>
         <w:br/>
-        <w:t>Gambar 5.2. Formulir Tambah Peminjaman.</w:t>
+        <w:t>Gambar 5.2. Formulir Peminjaman pada Detail Unit Fisik.</w:t>
         <w:br/>
         <w:t>Gambar 5.3. Formulir Penghapusan Aset dan Nomor BA.</w:t>
         <w:br/>
@@ -679,7 +679,7 @@
     </w:p>
     <w:p>
       <w:r>
-        <w:t>Tepat di atas tabel tersebut, klik tombol "+ Tambah Unit (Series)". Sebuah jendela kecil (pop-up) akan muncul di tengah layar.</w:t>
+        <w:t>Tepat di atas tabel tersebut, klik tombol "Tambah Series". Sistem akan membuka halaman formulir unit fisik.</w:t>
       </w:r>
     </w:p>
     <w:p>
@@ -724,6 +724,24 @@
       </w:r>
     </w:p>
     <w:p>
+      <w:pPr/>
+      <w:r>
+        <w:t>Merk: Isi nama produsen yang tercetak pada unit fisik (Contoh: Daikin). Kolom ini boleh dikosongkan jika identitas pabrik tidak terbaca.</w:t>
+      </w:r>
+    </w:p>
+    <w:p>
+      <w:pPr/>
+      <w:r>
+        <w:t>Model / Tipe: Isi kode model atau tipe unit sesuai pelat spesifikasi (Contoh: FTKC25TVM4). Jangan mengisi nama kategori umum pada kolom ini.</w:t>
+      </w:r>
+    </w:p>
+    <w:p>
+      <w:pPr/>
+      <w:r>
+        <w:t>Kapasitas: Isi kemampuan kerja unit beserta satuannya (Contoh: 1 PK, 500 liter, atau 5 kVA). Kolom ini bersifat opsional.</w:t>
+      </w:r>
+    </w:p>
+    <w:p>
       <w:r>
         <w:rPr>
           <w:b/>
@@ -736,13 +754,13 @@
     </w:p>
     <w:p>
       <w:r>
-        <w:rPr>
-          <w:b/>
-        </w:rPr>
-        <w:t xml:space="preserve">Kondisi Aset (Wajib Diisi): </w:t>
-      </w:r>
-      <w:r>
-        <w:t>Pilih kondisi fisik sarana saat Anda mendatanya pertama kali (Pilih: Baik / Rusak Ringan / Rusak Berat).</w:t>
+        <w:t>Kondisi: Pilih kondisi fisik sarana saat didata: Baik, Rusak Ringan, atau Rusak Berat. Form memilih "Baik" secara awal; ubah pilihan jika hasil pemeriksaan fisik berbeda.</w:t>
+      </w:r>
+    </w:p>
+    <w:p>
+      <w:pPr/>
+      <w:r>
+        <w:t>Tahun Pengadaan: Isi empat digit tahun unit diperoleh rumah sakit (Contoh: 2024). Gunakan dokumen pengadaan sebagai acuan dan biarkan kosong jika belum dapat diverifikasi.</w:t>
       </w:r>
     </w:p>
     <w:p>
@@ -914,7 +932,7 @@
         <w:pStyle w:val="Heading2"/>
       </w:pPr>
       <w:r>
-        <w:t>4. Mutasi Aset (Pindah Ruangan &amp; Kanibal Alat)</w:t>
+        <w:t>4. Mutasi Aset (Pindah Ruangan)</w:t>
       </w:r>
     </w:p>
     <w:tbl>
@@ -980,13 +998,7 @@
     </w:p>
     <w:p>
       <w:r>
-        <w:rPr>
-          <w:b/>
-        </w:rPr>
-        <w:t xml:space="preserve">⚠️ Aturan Wajib: </w:t>
-      </w:r>
-      <w:r>
-        <w:t>Anda DILARANG KERAS memindahkan catatan lokasi sarana prasarana menggunakan tombol "Edit" biasa! Seluruh pergerakan aset—baik yang dibongkar dan dipindahkan ke ruangan lain maupun yang ditarik ke gudang—WAJIB dicatat melalui menu khusus "Mutasi Aset". Hal ini agar jejak rekam pergerakannya (Audit Trail) terekam secara abadi dan jelas pertanggungjawabannya.</w:t>
+        <w:t>Aturan wajib: perpindahan unit ke ruangan lain harus dicatat melalui menu "Mutasi Aset" agar lokasi terbaru dan riwayat perpindahannya tetap konsisten.</w:t>
       </w:r>
     </w:p>
     <w:p>
@@ -1004,7 +1016,7 @@
     </w:p>
     <w:p>
       <w:r>
-        <w:t>Pada halaman yang terbuka, perhatikan pojok kanan atas, lalu klik tombol biru bertuliskan "+ Mutasi Baru".</w:t>
+        <w:t>Formulir "Catat Perpindahan Aset" langsung tersedia pada bagian atas halaman. Menu dan proses mutasi hanya tersedia untuk Admin.</w:t>
       </w:r>
     </w:p>
     <w:p>
@@ -1030,40 +1042,12 @@
     </w:p>
     <w:p>
       <w:r>
-        <w:t>Di bawahnya, terdapat kotak dropdown berjudul "Jenis Mutasi". Klik kotak tersebut, dan pilihlah salah satu dari 3 kondisi berikut:</w:t>
-      </w:r>
-    </w:p>
-    <w:p>
-      <w:r>
-        <w:rPr>
-          <w:b/>
-        </w:rPr>
-        <w:t xml:space="preserve">1. Pindah Ruangan: </w:t>
-      </w:r>
-      <w:r>
-        <w:t>Pilih ini jika alat (misalnya kursi tunggu atau Kipas Angin) akan digeser ke unit lain. Saat opsi ini dipilih, sebuah kotak baru bernama "Ruangan Tujuan" akan muncul. Anda wajib mengekliknya dan memilih nama ruangan penerima sarana tersebut.</w:t>
-      </w:r>
-    </w:p>
-    <w:p>
-      <w:r>
-        <w:rPr>
-          <w:b/>
-        </w:rPr>
-        <w:t xml:space="preserve">2. Simpan ke Gudang: </w:t>
-      </w:r>
-      <w:r>
-        <w:t>Pilih ini jika sarana sedang dibongkar/ditarik dari lapangan untuk diistirahatkan atau diamankan ke dalam gudang utama IPSRS.</w:t>
-      </w:r>
-    </w:p>
-    <w:p>
-      <w:r>
-        <w:rPr>
-          <w:b/>
-        </w:rPr>
-        <w:t xml:space="preserve">3. Jadikan Kanibal (Tindakan Ekstrem): </w:t>
-      </w:r>
-      <w:r>
-        <w:t>Pilih opsi ini HANYA JIKA sarana tersebut telah hancur atau afkir (tidak bisa diperbaiki lagi), namun pihak teknisi memutuskan untuk mempreteli komponennya (seperti kompresor AC atau motor listriknya) guna disimpan sebagai suku cadang (sparepart) cadangan. Saat Anda memilih ini, sistem akan otomatis "mematikan" status alat tersebut menjadi benda mati (Kanibal) dan tidak lagi dihitung sebagai aset utuh.</w:t>
+        <w:t>Pada dropdown "Jenis Mutasi", implementasi saat ini menyediakan satu aksi: "Pindah Ruangan". Setelah dipilih, kolom "Lokasi Tujuan" akan muncul dan wajib diisi dengan ruangan penerima.</w:t>
+      </w:r>
+    </w:p>
+    <w:p>
+      <w:r>
+        <w:t>Pilihan "Dibuang", "Rusak Total", "Simpan ke Gudang", atau "Jadikan Kanibal" tidak berada di dropdown mutasi. Untuk aset yang tidak dapat diperbaiki, buka detail unit, gunakan "Tandai Rusak Berat", lalu lanjutkan melalui alur Kanibalisasi atau Penghapusan yang terpisah.</w:t>
       </w:r>
     </w:p>
     <w:p>
@@ -1076,24 +1060,18 @@
     </w:p>
     <w:p>
       <w:r>
-        <w:rPr>
-          <w:b/>
-        </w:rPr>
-        <w:t xml:space="preserve">Petugas (Wajib Diisi): </w:t>
-      </w:r>
-      <w:r>
-        <w:t>Tuliskan nama jelas Anda atau nama teknisi yang bertugas melakukan pembongkaran/pemindahan.</w:t>
-      </w:r>
-    </w:p>
-    <w:p>
-      <w:r>
-        <w:rPr>
-          <w:b/>
-        </w:rPr>
-        <w:t xml:space="preserve">Catatan/Alasan (Wajib Diisi): </w:t>
-      </w:r>
-      <w:r>
-        <w:t>Ketikkan alasan singkat mengapa alat ini dipindah (Contoh ketikan: "Dipindah sementara karena AC utama di ruang Rapat sedang rusak").</w:t>
+        <w:t>Petugas (Wajib Diisi): Pilih Admin atau Teknisi yang melaksanakan perpindahan dari dropdown.</w:t>
+      </w:r>
+    </w:p>
+    <w:p>
+      <w:r>
+        <w:t>Tanggal (Wajib Diisi): Isi tanggal perpindahan aktual.</w:t>
+      </w:r>
+    </w:p>
+    <w:p>
+      <w:pPr/>
+      <w:r>
+        <w:t>Catatan (Opsional): Ketikkan alasan singkat mengapa alat dipindah.</w:t>
       </w:r>
     </w:p>
     <w:p>
@@ -1106,12 +1084,12 @@
     </w:p>
     <w:p>
       <w:r>
-        <w:t>Klik tombol "Proses Mutasi" di bagian paling bawah.</w:t>
-      </w:r>
-    </w:p>
-    <w:p>
-      <w:r>
-        <w:t>Sistem akan melakukan loading (memproses data). Status lokasi aset akan seketika berubah saat itu juga, dan yang paling penting: riwayat (kapan dipindah, jam berapa, oleh siapa, dan alasannya) akan terkunci secara permanen di dalam tabel riwayat.</w:t>
+        <w:t>Klik tombol "Simpan Mutasi" di bagian bawah formulir.</w:t>
+      </w:r>
+    </w:p>
+    <w:p>
+      <w:r>
+        <w:t>Sistem memperbarui lokasi unit dan menambahkan catatan pada tabel riwayat mutasi.</w:t>
       </w:r>
     </w:p>
     <w:p>
@@ -1731,6 +1709,12 @@
       </w:r>
     </w:p>
     <w:p>
+      <w:pPr/>
+      <w:r>
+        <w:t>Pembatasan hak akses: Admin melihat seluruh laporan; Teknisi hanya melihat laporan masuk yang dapat diklaim dan pekerjaan yang ditugaskan kepadanya; Pelapor hanya melihat laporan atas nama akunnya. URL milik pengguna lain tetap ditolak oleh server.</w:t>
+      </w:r>
+    </w:p>
+    <w:p>
       <w:pPr>
         <w:pStyle w:val="Heading2"/>
       </w:pPr>
@@ -1796,7 +1780,15 @@
         <w:pStyle w:val="Caption"/>
       </w:pPr>
       <w:r>
-        <w:t>Gambar 2.3. Halaman Daftar Laporan Kerusakan di Akun Teknisi.</w:t>
+        <w:t>Gambar 2.3. Halaman "Antrean &amp; Pekerjaan Teknisi" di Akun Teknisi (badge Teknisi).</w:t>
+      </w:r>
+    </w:p>
+    <w:p>
+      <w:pPr>
+        <w:pStyle w:val="Caption"/>
+      </w:pPr>
+      <w:r>
+        <w:t>Catatan gambar: gunakan tangkapan layar setelah login dengan role Teknisi; jangan gunakan tampilan Admin.</w:t>
       </w:r>
     </w:p>
     <w:p>
@@ -2371,30 +2363,12 @@
         <w:pStyle w:val="Caption"/>
       </w:pPr>
       <w:r>
-        <w:t>Gambar 2B.1. Halaman Daftar Tiket Laporan Milik Ruangan (Pelapor Internal).</w:t>
-      </w:r>
-    </w:p>
-    <w:p>
-      <w:r>
-        <w:t xml:space="preserve">Pada Modul 2 sebelumnya, kita telah membahas "Portal Publik" di mana siapa pun bisa melapor tanpa </w:t>
-      </w:r>
-      <w:r>
-        <w:rPr>
-          <w:i/>
-        </w:rPr>
-        <w:t>login</w:t>
-      </w:r>
-      <w:r>
-        <w:t xml:space="preserve">. Namun, bagaimana jika Anda adalah seorang </w:t>
-      </w:r>
-      <w:r>
-        <w:rPr>
-          <w:b/>
-        </w:rPr>
-        <w:t>Kepala Ruangan</w:t>
-      </w:r>
-      <w:r>
-        <w:t xml:space="preserve"> (misalnya Kepala IGD) yang ingin memantau seluruh proses perbaikan fasilitas di ruangan Anda secara resmi?</w:t>
+        <w:t>Gambar 2B.1. Halaman "Laporan Kerusakan Saya" di Akun Pelapor (badge Pelapor).</w:t>
+      </w:r>
+    </w:p>
+    <w:p>
+      <w:r>
+        <w:t>Pada Modul 2 sebelumnya dibahas Portal Publik. Akun Pelapor dipakai untuk membuat dan memantau laporan resmi melalui akun sendiri.</w:t>
       </w:r>
     </w:p>
     <w:p>
@@ -2409,6 +2383,12 @@
       </w:r>
       <w:r>
         <w:t xml:space="preserve"> kepada Anda.</w:t>
+      </w:r>
+    </w:p>
+    <w:p>
+      <w:pPr/>
+      <w:r>
+        <w:t>Cakupan data: akun Pelapor menampilkan laporan yang nama pelapornya sama dengan nama akun tersebut, bukan seluruh laporan publik dari pengguna lain dalam unit yang sama.</w:t>
       </w:r>
     </w:p>
     <w:p>
@@ -4079,7 +4059,7 @@
     </w:p>
     <w:p>
       <w:r>
-        <w:t>Gunakan menu ini jika ada unit/ruangan yang ingin meminjam sarana IPSRS secara sementara.</w:t>
+        <w:t>Gunakan menu ini jika ada unit/ruangan yang ingin meminjam sarana IPSRS secara sementara. Peminjaman dan pengembalian hanya dapat dicatat oleh Admin.</w:t>
       </w:r>
     </w:p>
     <w:tbl>
@@ -4140,7 +4120,7 @@
         <w:pStyle w:val="Caption"/>
       </w:pPr>
       <w:r>
-        <w:t>Gambar 5.2. Formulir Tambah Peminjaman.</w:t>
+        <w:t>Gambar 5.2. Tombol Pinjamkan dan Formulir Peminjaman pada Detail Unit Fisik.</w:t>
       </w:r>
     </w:p>
     <w:p>
@@ -4158,27 +4138,27 @@
     </w:p>
     <w:p>
       <w:r>
-        <w:t>Klik tombol "+ Pinjam Baru" di pojok kanan atas.</w:t>
-      </w:r>
-    </w:p>
-    <w:p>
-      <w:r>
-        <w:t>Pada kotak pencarian (Pilih Aset), cari dan pilih sarana yang akan dipinjamkan (Contoh: "Kipas Angin Berdiri").</w:t>
-      </w:r>
-    </w:p>
-    <w:p>
-      <w:r>
-        <w:t>Pada kolom Peminjam/Ruangan (Wajib Diisi), ketikkan nama orang atau ruangan yang meminjam (Contoh: "Ruang Rapat Utama").</w:t>
-      </w:r>
-    </w:p>
-    <w:p>
-      <w:r>
-        <w:t>Pada kolom Tanggal Pinjam (Wajib Diisi), tentukan tanggal barang diserahkan.</w:t>
-      </w:r>
-    </w:p>
-    <w:p>
-      <w:r>
-        <w:t>Klik "Simpan Peminjaman". Sistem akan mengubah status Kipas Angin tersebut menjadi "Dipinjam", sehingga teknisi lain tidak kebingungan mencari barang tersebut di gudang.</w:t>
+        <w:t>Klik tombol "Pinjam Aset". Sistem membuka daftar aset berstatus "Tersedia", lalu buka detail unit fisik yang tepat dan klik "Pinjamkan".</w:t>
+      </w:r>
+    </w:p>
+    <w:p>
+      <w:r>
+        <w:t>Pastikan nomor inventaris, lokasi, dan status unit sudah benar karena peminjaman dicatat per unit fisik.</w:t>
+      </w:r>
+    </w:p>
+    <w:p>
+      <w:r>
+        <w:t>Isi Nama Peminjam dan Unit Peminjam; keduanya wajib diisi.</w:t>
+      </w:r>
+    </w:p>
+    <w:p>
+      <w:r>
+        <w:t>Isi Rencana Kembali dan Keterangan bila diperlukan. Tanggal pinjam dicatat otomatis oleh sistem.</w:t>
+      </w:r>
+    </w:p>
+    <w:p>
+      <w:r>
+        <w:t>Klik "Pinjamkan". Sistem mencatat peminjaman dan mengubah status unit menjadi "Dipinjam".</w:t>
       </w:r>
     </w:p>
     <w:p>
@@ -4196,12 +4176,12 @@
     </w:p>
     <w:p>
       <w:r>
-        <w:t>Cari baris peminjaman Kipas Angin tadi, lalu klik tombol "Kembalikan" (ikon centang).</w:t>
-      </w:r>
-    </w:p>
-    <w:p>
-      <w:r>
-        <w:t>Sistem akan mencatat Tanggal Kembali secara otomatis dan merubah status kipas angin kembali "Tersedia".</w:t>
+        <w:t>Cari catatan berstatus "Dipinjam", klik "Lihat Aset", lalu pilih "Terima Pengembalian" pada detail unit.</w:t>
+      </w:r>
+    </w:p>
+    <w:p>
+      <w:r>
+        <w:t>Sistem mencatat tanggal kembali aktual, menutup peminjaman menjadi "Selesai", dan mengubah status unit menjadi "Tersedia".</w:t>
       </w:r>
     </w:p>
     <w:p>

</xml_diff>